<commit_message>
Actualizacion del template de la tabla de CNVs
Co-Authored-By: Claude Opus 5.5 <noreply@anthropic.com>
</commit_message>
<xml_diff>
--- a/templates/table_cnv.docx
+++ b/templates/table_cnv.docx
@@ -1,10 +1,10 @@
 
 <file path=word/document.xml><?xml version="1.0" encoding="utf-8"?>
-<w:document xmlns:wpc="http://schemas.microsoft.com/office/word/2010/wordprocessingCanvas" xmlns:cx="http://schemas.microsoft.com/office/drawing/2014/chartex" xmlns:cx1="http://schemas.microsoft.com/office/drawing/2015/9/8/chartex" xmlns:cx2="http://schemas.microsoft.com/office/drawing/2015/10/21/chartex" xmlns:cx3="http://schemas.microsoft.com/office/drawing/2016/5/9/chartex" xmlns:cx4="http://schemas.microsoft.com/office/drawing/2016/5/10/chartex" xmlns:cx5="http://schemas.microsoft.com/office/drawing/2016/5/11/chartex" xmlns:cx6="http://schemas.microsoft.com/office/drawing/2016/5/12/chartex" xmlns:cx7="http://schemas.microsoft.com/office/drawing/2016/5/13/chartex" xmlns:cx8="http://schemas.microsoft.com/office/drawing/2016/5/14/chartex" xmlns:mc="http://schemas.openxmlformats.org/markup-compatibility/2006" xmlns:aink="http://schemas.microsoft.com/office/drawing/2016/ink" xmlns:am3d="http://schemas.microsoft.com/office/drawing/2017/model3d" xmlns:o="urn:schemas-microsoft-com:office:office" xmlns:oel="http://schemas.microsoft.com/office/2019/extlst" xmlns:r="http://schemas.openxmlformats.org/officeDocument/2006/relationships" xmlns:m="http://schemas.openxmlformats.org/officeDocument/2006/math" xmlns:v="urn:schemas-microsoft-com:vml" xmlns:wp14="http://schemas.microsoft.com/office/word/2010/wordprocessingDrawing" xmlns:wp="http://schemas.openxmlformats.org/drawingml/2006/wordprocessingDrawing" xmlns:w10="urn:schemas-microsoft-com:office:word" xmlns:w="http://schemas.openxmlformats.org/wordprocessingml/2006/main" xmlns:w14="http://schemas.microsoft.com/office/word/2010/wordml" xmlns:w15="http://schemas.microsoft.com/office/word/2012/wordml" xmlns:w16cei="http://schemas.microsoft.com/office/word/2026/wordml/cei" xmlns:w16cex="http://schemas.microsoft.com/office/word/2018/wordml/cex" xmlns:w16cid="http://schemas.microsoft.com/office/word/2016/wordml/cid" xmlns:w16="http://schemas.microsoft.com/office/word/2018/wordml" xmlns:w16du="http://schemas.microsoft.com/office/word/2023/wordml/word16du" xmlns:w16sdtdh="http://schemas.microsoft.com/office/word/2020/wordml/sdtdatahash" xmlns:w16sdtfl="http://schemas.microsoft.com/office/word/2024/wordml/sdtformatlock" xmlns:w16se="http://schemas.microsoft.com/office/word/2015/wordml/symex" xmlns:wpg="http://schemas.microsoft.com/office/word/2010/wordprocessingGroup" xmlns:wpi="http://schemas.microsoft.com/office/word/2010/wordprocessingInk" xmlns:wne="http://schemas.microsoft.com/office/word/2006/wordml" xmlns:wps="http://schemas.microsoft.com/office/word/2010/wordprocessingShape" mc:Ignorable="w14 w15 w16se w16cid w16 w16cex w16sdtdh w16sdtfl w16du wp14">
+<w:document xmlns:wpc="http://schemas.microsoft.com/office/word/2010/wordprocessingCanvas" xmlns:cx="http://schemas.microsoft.com/office/drawing/2014/chartex" xmlns:cx1="http://schemas.microsoft.com/office/drawing/2015/9/8/chartex" xmlns:cx2="http://schemas.microsoft.com/office/drawing/2015/10/21/chartex" xmlns:cx3="http://schemas.microsoft.com/office/drawing/2016/5/9/chartex" xmlns:cx4="http://schemas.microsoft.com/office/drawing/2016/5/10/chartex" xmlns:cx5="http://schemas.microsoft.com/office/drawing/2016/5/11/chartex" xmlns:cx6="http://schemas.microsoft.com/office/drawing/2016/5/12/chartex" xmlns:cx7="http://schemas.microsoft.com/office/drawing/2016/5/13/chartex" xmlns:cx8="http://schemas.microsoft.com/office/drawing/2016/5/14/chartex" xmlns:mc="http://schemas.openxmlformats.org/markup-compatibility/2006" xmlns:aink="http://schemas.microsoft.com/office/drawing/2016/ink" xmlns:am3d="http://schemas.microsoft.com/office/drawing/2017/model3d" xmlns:o="urn:schemas-microsoft-com:office:office" xmlns:oel="http://schemas.microsoft.com/office/2019/extlst" xmlns:r="http://schemas.openxmlformats.org/officeDocument/2006/relationships" xmlns:m="http://schemas.openxmlformats.org/officeDocument/2006/math" xmlns:v="urn:schemas-microsoft-com:vml" xmlns:wp14="http://schemas.microsoft.com/office/word/2010/wordprocessingDrawing" xmlns:wp="http://schemas.openxmlformats.org/drawingml/2006/wordprocessingDrawing" xmlns:w10="urn:schemas-microsoft-com:office:word" xmlns:w="http://schemas.openxmlformats.org/wordprocessingml/2006/main" xmlns:w14="http://schemas.microsoft.com/office/word/2010/wordml" xmlns:w15="http://schemas.microsoft.com/office/word/2012/wordml" xmlns:w16cex="http://schemas.microsoft.com/office/word/2018/wordml/cex" xmlns:w16cid="http://schemas.microsoft.com/office/word/2016/wordml/cid" xmlns:w16="http://schemas.microsoft.com/office/word/2018/wordml" xmlns:w16du="http://schemas.microsoft.com/office/word/2023/wordml/word16du" xmlns:w16sdtdh="http://schemas.microsoft.com/office/word/2020/wordml/sdtdatahash" xmlns:w16sdtfl="http://schemas.microsoft.com/office/word/2024/wordml/sdtformatlock" xmlns:w16se="http://schemas.microsoft.com/office/word/2015/wordml/symex" xmlns:wpg="http://schemas.microsoft.com/office/word/2010/wordprocessingGroup" xmlns:wpi="http://schemas.microsoft.com/office/word/2010/wordprocessingInk" xmlns:wne="http://schemas.microsoft.com/office/word/2006/wordml" xmlns:wps="http://schemas.microsoft.com/office/word/2010/wordprocessingShape" mc:Ignorable="w14 w15 w16se w16cid w16 w16cex w16sdtdh w16sdtfl w16du wp14">
   <w:body>
     <w:tbl>
       <w:tblPr>
-        <w:tblStyle w:val="Tablaconcuadrcula"/>
+        <w:tblStyle w:val="TableGrid"/>
         <w:tblpPr w:leftFromText="141" w:rightFromText="141" w:vertAnchor="text" w:horzAnchor="margin" w:tblpX="-34" w:tblpY="60"/>
         <w:tblW w:w="10490" w:type="dxa"/>
         <w:tblBorders>
@@ -226,7 +226,6 @@
           <w:tcPr>
             <w:tcW w:w="1100" w:type="dxa"/>
             <w:tcBorders>
-              <w:top w:val="double" w:sz="4" w:space="0" w:color="7030A0"/>
               <w:bottom w:val="double" w:sz="4" w:space="0" w:color="7030A0"/>
             </w:tcBorders>
             <w:shd w:val="clear" w:color="auto" w:fill="FFFFFF"/>
@@ -248,7 +247,6 @@
           <w:tcPr>
             <w:tcW w:w="2500" w:type="dxa"/>
             <w:tcBorders>
-              <w:top w:val="double" w:sz="4" w:space="0" w:color="7030A0"/>
               <w:bottom w:val="double" w:sz="4" w:space="0" w:color="7030A0"/>
             </w:tcBorders>
             <w:shd w:val="clear" w:color="auto" w:fill="FFFFFF"/>
@@ -270,7 +268,6 @@
           <w:tcPr>
             <w:tcW w:w="1500" w:type="dxa"/>
             <w:tcBorders>
-              <w:top w:val="double" w:sz="4" w:space="0" w:color="7030A0"/>
               <w:bottom w:val="double" w:sz="4" w:space="0" w:color="7030A0"/>
             </w:tcBorders>
             <w:shd w:val="clear" w:color="auto" w:fill="FFFFFF"/>
@@ -292,7 +289,6 @@
           <w:tcPr>
             <w:tcW w:w="2800" w:type="dxa"/>
             <w:tcBorders>
-              <w:top w:val="double" w:sz="4" w:space="0" w:color="7030A0"/>
               <w:bottom w:val="double" w:sz="4" w:space="0" w:color="7030A0"/>
             </w:tcBorders>
             <w:shd w:val="clear" w:color="auto" w:fill="FFFFFF"/>
@@ -314,7 +310,6 @@
           <w:tcPr>
             <w:tcW w:w="1640" w:type="dxa"/>
             <w:tcBorders>
-              <w:top w:val="double" w:sz="4" w:space="0" w:color="7030A0"/>
               <w:bottom w:val="double" w:sz="4" w:space="0" w:color="7030A0"/>
             </w:tcBorders>
             <w:shd w:val="clear" w:color="auto" w:fill="FFFFFF"/>
@@ -337,7 +332,6 @@
           <w:tcPr>
             <w:tcW w:w="950" w:type="dxa"/>
             <w:tcBorders>
-              <w:top w:val="double" w:sz="4" w:space="0" w:color="7030A0"/>
               <w:bottom w:val="double" w:sz="4" w:space="0" w:color="7030A0"/>
             </w:tcBorders>
             <w:shd w:val="clear" w:color="auto" w:fill="FFFFFF"/>
@@ -770,11 +764,11 @@
     <w:qFormat/>
     <w:rsid w:val="00897107"/>
   </w:style>
-  <w:style w:type="paragraph" w:styleId="Ttulo1">
+  <w:style w:type="paragraph" w:styleId="Heading1">
     <w:name w:val="heading 1"/>
     <w:basedOn w:val="Normal"/>
     <w:next w:val="Normal"/>
-    <w:link w:val="Ttulo1Car"/>
+    <w:link w:val="Heading1Char"/>
     <w:uiPriority w:val="9"/>
     <w:qFormat/>
     <w:rsid w:val="003D2CA1"/>
@@ -791,11 +785,11 @@
       <w:szCs w:val="40"/>
     </w:rPr>
   </w:style>
-  <w:style w:type="paragraph" w:styleId="Ttulo2">
+  <w:style w:type="paragraph" w:styleId="Heading2">
     <w:name w:val="heading 2"/>
     <w:basedOn w:val="Normal"/>
     <w:next w:val="Normal"/>
-    <w:link w:val="Ttulo2Car"/>
+    <w:link w:val="Heading2Char"/>
     <w:uiPriority w:val="9"/>
     <w:semiHidden/>
     <w:unhideWhenUsed/>
@@ -814,11 +808,11 @@
       <w:szCs w:val="32"/>
     </w:rPr>
   </w:style>
-  <w:style w:type="paragraph" w:styleId="Ttulo3">
+  <w:style w:type="paragraph" w:styleId="Heading3">
     <w:name w:val="heading 3"/>
     <w:basedOn w:val="Normal"/>
     <w:next w:val="Normal"/>
-    <w:link w:val="Ttulo3Car"/>
+    <w:link w:val="Heading3Char"/>
     <w:uiPriority w:val="9"/>
     <w:semiHidden/>
     <w:unhideWhenUsed/>
@@ -837,11 +831,11 @@
       <w:szCs w:val="28"/>
     </w:rPr>
   </w:style>
-  <w:style w:type="paragraph" w:styleId="Ttulo4">
+  <w:style w:type="paragraph" w:styleId="Heading4">
     <w:name w:val="heading 4"/>
     <w:basedOn w:val="Normal"/>
     <w:next w:val="Normal"/>
-    <w:link w:val="Ttulo4Car"/>
+    <w:link w:val="Heading4Char"/>
     <w:uiPriority w:val="9"/>
     <w:semiHidden/>
     <w:unhideWhenUsed/>
@@ -860,11 +854,11 @@
       <w:color w:val="0F4761" w:themeColor="accent1" w:themeShade="BF"/>
     </w:rPr>
   </w:style>
-  <w:style w:type="paragraph" w:styleId="Ttulo5">
+  <w:style w:type="paragraph" w:styleId="Heading5">
     <w:name w:val="heading 5"/>
     <w:basedOn w:val="Normal"/>
     <w:next w:val="Normal"/>
-    <w:link w:val="Ttulo5Car"/>
+    <w:link w:val="Heading5Char"/>
     <w:uiPriority w:val="9"/>
     <w:semiHidden/>
     <w:unhideWhenUsed/>
@@ -881,11 +875,11 @@
       <w:color w:val="0F4761" w:themeColor="accent1" w:themeShade="BF"/>
     </w:rPr>
   </w:style>
-  <w:style w:type="paragraph" w:styleId="Ttulo6">
+  <w:style w:type="paragraph" w:styleId="Heading6">
     <w:name w:val="heading 6"/>
     <w:basedOn w:val="Normal"/>
     <w:next w:val="Normal"/>
-    <w:link w:val="Ttulo6Car"/>
+    <w:link w:val="Heading6Char"/>
     <w:uiPriority w:val="9"/>
     <w:semiHidden/>
     <w:unhideWhenUsed/>
@@ -904,11 +898,11 @@
       <w:color w:val="595959" w:themeColor="text1" w:themeTint="A6"/>
     </w:rPr>
   </w:style>
-  <w:style w:type="paragraph" w:styleId="Ttulo7">
+  <w:style w:type="paragraph" w:styleId="Heading7">
     <w:name w:val="heading 7"/>
     <w:basedOn w:val="Normal"/>
     <w:next w:val="Normal"/>
-    <w:link w:val="Ttulo7Car"/>
+    <w:link w:val="Heading7Char"/>
     <w:uiPriority w:val="9"/>
     <w:semiHidden/>
     <w:unhideWhenUsed/>
@@ -925,11 +919,11 @@
       <w:color w:val="595959" w:themeColor="text1" w:themeTint="A6"/>
     </w:rPr>
   </w:style>
-  <w:style w:type="paragraph" w:styleId="Ttulo8">
+  <w:style w:type="paragraph" w:styleId="Heading8">
     <w:name w:val="heading 8"/>
     <w:basedOn w:val="Normal"/>
     <w:next w:val="Normal"/>
-    <w:link w:val="Ttulo8Car"/>
+    <w:link w:val="Heading8Char"/>
     <w:uiPriority w:val="9"/>
     <w:semiHidden/>
     <w:unhideWhenUsed/>
@@ -948,11 +942,11 @@
       <w:color w:val="272727" w:themeColor="text1" w:themeTint="D8"/>
     </w:rPr>
   </w:style>
-  <w:style w:type="paragraph" w:styleId="Ttulo9">
+  <w:style w:type="paragraph" w:styleId="Heading9">
     <w:name w:val="heading 9"/>
     <w:basedOn w:val="Normal"/>
     <w:next w:val="Normal"/>
-    <w:link w:val="Ttulo9Car"/>
+    <w:link w:val="Heading9Char"/>
     <w:uiPriority w:val="9"/>
     <w:semiHidden/>
     <w:unhideWhenUsed/>
@@ -969,13 +963,13 @@
       <w:color w:val="272727" w:themeColor="text1" w:themeTint="D8"/>
     </w:rPr>
   </w:style>
-  <w:style w:type="character" w:default="1" w:styleId="Fuentedeprrafopredeter">
+  <w:style w:type="character" w:default="1" w:styleId="DefaultParagraphFont">
     <w:name w:val="Default Paragraph Font"/>
     <w:uiPriority w:val="1"/>
     <w:semiHidden/>
     <w:unhideWhenUsed/>
   </w:style>
-  <w:style w:type="table" w:default="1" w:styleId="Tablanormal">
+  <w:style w:type="table" w:default="1" w:styleId="TableNormal">
     <w:name w:val="Normal Table"/>
     <w:uiPriority w:val="99"/>
     <w:semiHidden/>
@@ -990,16 +984,16 @@
       </w:tblCellMar>
     </w:tblPr>
   </w:style>
-  <w:style w:type="numbering" w:default="1" w:styleId="Sinlista">
+  <w:style w:type="numbering" w:default="1" w:styleId="NoList">
     <w:name w:val="No List"/>
     <w:uiPriority w:val="99"/>
     <w:semiHidden/>
     <w:unhideWhenUsed/>
   </w:style>
-  <w:style w:type="character" w:customStyle="1" w:styleId="Ttulo1Car">
-    <w:name w:val="Título 1 Car"/>
-    <w:basedOn w:val="Fuentedeprrafopredeter"/>
-    <w:link w:val="Ttulo1"/>
+  <w:style w:type="character" w:customStyle="1" w:styleId="Heading1Char">
+    <w:name w:val="Heading 1 Char"/>
+    <w:basedOn w:val="DefaultParagraphFont"/>
+    <w:link w:val="Heading1"/>
     <w:uiPriority w:val="9"/>
     <w:rsid w:val="003D2CA1"/>
     <w:rPr>
@@ -1009,10 +1003,10 @@
       <w:szCs w:val="40"/>
     </w:rPr>
   </w:style>
-  <w:style w:type="character" w:customStyle="1" w:styleId="Ttulo2Car">
-    <w:name w:val="Título 2 Car"/>
-    <w:basedOn w:val="Fuentedeprrafopredeter"/>
-    <w:link w:val="Ttulo2"/>
+  <w:style w:type="character" w:customStyle="1" w:styleId="Heading2Char">
+    <w:name w:val="Heading 2 Char"/>
+    <w:basedOn w:val="DefaultParagraphFont"/>
+    <w:link w:val="Heading2"/>
     <w:uiPriority w:val="9"/>
     <w:semiHidden/>
     <w:rsid w:val="003D2CA1"/>
@@ -1023,10 +1017,10 @@
       <w:szCs w:val="32"/>
     </w:rPr>
   </w:style>
-  <w:style w:type="character" w:customStyle="1" w:styleId="Ttulo3Car">
-    <w:name w:val="Título 3 Car"/>
-    <w:basedOn w:val="Fuentedeprrafopredeter"/>
-    <w:link w:val="Ttulo3"/>
+  <w:style w:type="character" w:customStyle="1" w:styleId="Heading3Char">
+    <w:name w:val="Heading 3 Char"/>
+    <w:basedOn w:val="DefaultParagraphFont"/>
+    <w:link w:val="Heading3"/>
     <w:uiPriority w:val="9"/>
     <w:semiHidden/>
     <w:rsid w:val="003D2CA1"/>
@@ -1037,10 +1031,10 @@
       <w:szCs w:val="28"/>
     </w:rPr>
   </w:style>
-  <w:style w:type="character" w:customStyle="1" w:styleId="Ttulo4Car">
-    <w:name w:val="Título 4 Car"/>
-    <w:basedOn w:val="Fuentedeprrafopredeter"/>
-    <w:link w:val="Ttulo4"/>
+  <w:style w:type="character" w:customStyle="1" w:styleId="Heading4Char">
+    <w:name w:val="Heading 4 Char"/>
+    <w:basedOn w:val="DefaultParagraphFont"/>
+    <w:link w:val="Heading4"/>
     <w:uiPriority w:val="9"/>
     <w:semiHidden/>
     <w:rsid w:val="003D2CA1"/>
@@ -1051,10 +1045,10 @@
       <w:color w:val="0F4761" w:themeColor="accent1" w:themeShade="BF"/>
     </w:rPr>
   </w:style>
-  <w:style w:type="character" w:customStyle="1" w:styleId="Ttulo5Car">
-    <w:name w:val="Título 5 Car"/>
-    <w:basedOn w:val="Fuentedeprrafopredeter"/>
-    <w:link w:val="Ttulo5"/>
+  <w:style w:type="character" w:customStyle="1" w:styleId="Heading5Char">
+    <w:name w:val="Heading 5 Char"/>
+    <w:basedOn w:val="DefaultParagraphFont"/>
+    <w:link w:val="Heading5"/>
     <w:uiPriority w:val="9"/>
     <w:semiHidden/>
     <w:rsid w:val="003D2CA1"/>
@@ -1063,10 +1057,10 @@
       <w:color w:val="0F4761" w:themeColor="accent1" w:themeShade="BF"/>
     </w:rPr>
   </w:style>
-  <w:style w:type="character" w:customStyle="1" w:styleId="Ttulo6Car">
-    <w:name w:val="Título 6 Car"/>
-    <w:basedOn w:val="Fuentedeprrafopredeter"/>
-    <w:link w:val="Ttulo6"/>
+  <w:style w:type="character" w:customStyle="1" w:styleId="Heading6Char">
+    <w:name w:val="Heading 6 Char"/>
+    <w:basedOn w:val="DefaultParagraphFont"/>
+    <w:link w:val="Heading6"/>
     <w:uiPriority w:val="9"/>
     <w:semiHidden/>
     <w:rsid w:val="003D2CA1"/>
@@ -1077,10 +1071,10 @@
       <w:color w:val="595959" w:themeColor="text1" w:themeTint="A6"/>
     </w:rPr>
   </w:style>
-  <w:style w:type="character" w:customStyle="1" w:styleId="Ttulo7Car">
-    <w:name w:val="Título 7 Car"/>
-    <w:basedOn w:val="Fuentedeprrafopredeter"/>
-    <w:link w:val="Ttulo7"/>
+  <w:style w:type="character" w:customStyle="1" w:styleId="Heading7Char">
+    <w:name w:val="Heading 7 Char"/>
+    <w:basedOn w:val="DefaultParagraphFont"/>
+    <w:link w:val="Heading7"/>
     <w:uiPriority w:val="9"/>
     <w:semiHidden/>
     <w:rsid w:val="003D2CA1"/>
@@ -1089,10 +1083,10 @@
       <w:color w:val="595959" w:themeColor="text1" w:themeTint="A6"/>
     </w:rPr>
   </w:style>
-  <w:style w:type="character" w:customStyle="1" w:styleId="Ttulo8Car">
-    <w:name w:val="Título 8 Car"/>
-    <w:basedOn w:val="Fuentedeprrafopredeter"/>
-    <w:link w:val="Ttulo8"/>
+  <w:style w:type="character" w:customStyle="1" w:styleId="Heading8Char">
+    <w:name w:val="Heading 8 Char"/>
+    <w:basedOn w:val="DefaultParagraphFont"/>
+    <w:link w:val="Heading8"/>
     <w:uiPriority w:val="9"/>
     <w:semiHidden/>
     <w:rsid w:val="003D2CA1"/>
@@ -1103,10 +1097,10 @@
       <w:color w:val="272727" w:themeColor="text1" w:themeTint="D8"/>
     </w:rPr>
   </w:style>
-  <w:style w:type="character" w:customStyle="1" w:styleId="Ttulo9Car">
-    <w:name w:val="Título 9 Car"/>
-    <w:basedOn w:val="Fuentedeprrafopredeter"/>
-    <w:link w:val="Ttulo9"/>
+  <w:style w:type="character" w:customStyle="1" w:styleId="Heading9Char">
+    <w:name w:val="Heading 9 Char"/>
+    <w:basedOn w:val="DefaultParagraphFont"/>
+    <w:link w:val="Heading9"/>
     <w:uiPriority w:val="9"/>
     <w:semiHidden/>
     <w:rsid w:val="003D2CA1"/>
@@ -1115,11 +1109,11 @@
       <w:color w:val="272727" w:themeColor="text1" w:themeTint="D8"/>
     </w:rPr>
   </w:style>
-  <w:style w:type="paragraph" w:styleId="Ttulo">
+  <w:style w:type="paragraph" w:styleId="Title">
     <w:name w:val="Title"/>
     <w:basedOn w:val="Normal"/>
     <w:next w:val="Normal"/>
-    <w:link w:val="TtuloCar"/>
+    <w:link w:val="TitleChar"/>
     <w:uiPriority w:val="10"/>
     <w:qFormat/>
     <w:rsid w:val="003D2CA1"/>
@@ -1135,10 +1129,10 @@
       <w:szCs w:val="56"/>
     </w:rPr>
   </w:style>
-  <w:style w:type="character" w:customStyle="1" w:styleId="TtuloCar">
-    <w:name w:val="Título Car"/>
-    <w:basedOn w:val="Fuentedeprrafopredeter"/>
-    <w:link w:val="Ttulo"/>
+  <w:style w:type="character" w:customStyle="1" w:styleId="TitleChar">
+    <w:name w:val="Title Char"/>
+    <w:basedOn w:val="DefaultParagraphFont"/>
+    <w:link w:val="Title"/>
     <w:uiPriority w:val="10"/>
     <w:rsid w:val="003D2CA1"/>
     <w:rPr>
@@ -1149,11 +1143,11 @@
       <w:szCs w:val="56"/>
     </w:rPr>
   </w:style>
-  <w:style w:type="paragraph" w:styleId="Subttulo">
+  <w:style w:type="paragraph" w:styleId="Subtitle">
     <w:name w:val="Subtitle"/>
     <w:basedOn w:val="Normal"/>
     <w:next w:val="Normal"/>
-    <w:link w:val="SubttuloCar"/>
+    <w:link w:val="SubtitleChar"/>
     <w:uiPriority w:val="11"/>
     <w:qFormat/>
     <w:rsid w:val="003D2CA1"/>
@@ -1170,10 +1164,10 @@
       <w:szCs w:val="28"/>
     </w:rPr>
   </w:style>
-  <w:style w:type="character" w:customStyle="1" w:styleId="SubttuloCar">
-    <w:name w:val="Subtítulo Car"/>
-    <w:basedOn w:val="Fuentedeprrafopredeter"/>
-    <w:link w:val="Subttulo"/>
+  <w:style w:type="character" w:customStyle="1" w:styleId="SubtitleChar">
+    <w:name w:val="Subtitle Char"/>
+    <w:basedOn w:val="DefaultParagraphFont"/>
+    <w:link w:val="Subtitle"/>
     <w:uiPriority w:val="11"/>
     <w:rsid w:val="003D2CA1"/>
     <w:rPr>
@@ -1184,11 +1178,11 @@
       <w:szCs w:val="28"/>
     </w:rPr>
   </w:style>
-  <w:style w:type="paragraph" w:styleId="Cita">
+  <w:style w:type="paragraph" w:styleId="Quote">
     <w:name w:val="Quote"/>
     <w:basedOn w:val="Normal"/>
     <w:next w:val="Normal"/>
-    <w:link w:val="CitaCar"/>
+    <w:link w:val="QuoteChar"/>
     <w:uiPriority w:val="29"/>
     <w:qFormat/>
     <w:rsid w:val="003D2CA1"/>
@@ -1202,10 +1196,10 @@
       <w:color w:val="404040" w:themeColor="text1" w:themeTint="BF"/>
     </w:rPr>
   </w:style>
-  <w:style w:type="character" w:customStyle="1" w:styleId="CitaCar">
-    <w:name w:val="Cita Car"/>
-    <w:basedOn w:val="Fuentedeprrafopredeter"/>
-    <w:link w:val="Cita"/>
+  <w:style w:type="character" w:customStyle="1" w:styleId="QuoteChar">
+    <w:name w:val="Quote Char"/>
+    <w:basedOn w:val="DefaultParagraphFont"/>
+    <w:link w:val="Quote"/>
     <w:uiPriority w:val="29"/>
     <w:rsid w:val="003D2CA1"/>
     <w:rPr>
@@ -1214,7 +1208,7 @@
       <w:color w:val="404040" w:themeColor="text1" w:themeTint="BF"/>
     </w:rPr>
   </w:style>
-  <w:style w:type="paragraph" w:styleId="Prrafodelista">
+  <w:style w:type="paragraph" w:styleId="ListParagraph">
     <w:name w:val="List Paragraph"/>
     <w:basedOn w:val="Normal"/>
     <w:uiPriority w:val="34"/>
@@ -1225,9 +1219,9 @@
       <w:contextualSpacing/>
     </w:pPr>
   </w:style>
-  <w:style w:type="character" w:styleId="nfasisintenso">
+  <w:style w:type="character" w:styleId="IntenseEmphasis">
     <w:name w:val="Intense Emphasis"/>
-    <w:basedOn w:val="Fuentedeprrafopredeter"/>
+    <w:basedOn w:val="DefaultParagraphFont"/>
     <w:uiPriority w:val="21"/>
     <w:qFormat/>
     <w:rsid w:val="003D2CA1"/>
@@ -1237,11 +1231,11 @@
       <w:color w:val="0F4761" w:themeColor="accent1" w:themeShade="BF"/>
     </w:rPr>
   </w:style>
-  <w:style w:type="paragraph" w:styleId="Citadestacada">
+  <w:style w:type="paragraph" w:styleId="IntenseQuote">
     <w:name w:val="Intense Quote"/>
     <w:basedOn w:val="Normal"/>
     <w:next w:val="Normal"/>
-    <w:link w:val="CitadestacadaCar"/>
+    <w:link w:val="IntenseQuoteChar"/>
     <w:uiPriority w:val="30"/>
     <w:qFormat/>
     <w:rsid w:val="003D2CA1"/>
@@ -1260,10 +1254,10 @@
       <w:color w:val="0F4761" w:themeColor="accent1" w:themeShade="BF"/>
     </w:rPr>
   </w:style>
-  <w:style w:type="character" w:customStyle="1" w:styleId="CitadestacadaCar">
-    <w:name w:val="Cita destacada Car"/>
-    <w:basedOn w:val="Fuentedeprrafopredeter"/>
-    <w:link w:val="Citadestacada"/>
+  <w:style w:type="character" w:customStyle="1" w:styleId="IntenseQuoteChar">
+    <w:name w:val="Intense Quote Char"/>
+    <w:basedOn w:val="DefaultParagraphFont"/>
+    <w:link w:val="IntenseQuote"/>
     <w:uiPriority w:val="30"/>
     <w:rsid w:val="003D2CA1"/>
     <w:rPr>
@@ -1272,9 +1266,9 @@
       <w:color w:val="0F4761" w:themeColor="accent1" w:themeShade="BF"/>
     </w:rPr>
   </w:style>
-  <w:style w:type="character" w:styleId="Referenciaintensa">
+  <w:style w:type="character" w:styleId="IntenseReference">
     <w:name w:val="Intense Reference"/>
-    <w:basedOn w:val="Fuentedeprrafopredeter"/>
+    <w:basedOn w:val="DefaultParagraphFont"/>
     <w:uiPriority w:val="32"/>
     <w:qFormat/>
     <w:rsid w:val="003D2CA1"/>
@@ -1286,9 +1280,9 @@
       <w:spacing w:val="5"/>
     </w:rPr>
   </w:style>
-  <w:style w:type="table" w:styleId="Tablaconcuadrcula">
+  <w:style w:type="table" w:styleId="TableGrid">
     <w:name w:val="Table Grid"/>
-    <w:basedOn w:val="Tablanormal"/>
+    <w:basedOn w:val="TableNormal"/>
     <w:uiPriority w:val="59"/>
     <w:rsid w:val="002B3885"/>
     <w:pPr>

</xml_diff>